<commit_message>
docs: apply methodology framing alignment pass
</commit_message>
<xml_diff>
--- a/docs/Oros - CKM Data Readiness - Architecture Specification.docx
+++ b/docs/Oros - CKM Data Readiness - Architecture Specification.docx
@@ -43,27 +43,7 @@
           <w:sz w:val="24"/>
           <w:szCs w:val="24"/>
         </w:rPr>
-        <w:t xml:space="preserve">Version </w:t>
-      </w:r>
-      <w:proofErr w:type="gramStart"/>
-      <w:r>
-        <w:rPr>
-          <w:i/>
-          <w:iCs/>
-          <w:sz w:val="24"/>
-          <w:szCs w:val="24"/>
-        </w:rPr>
-        <w:t>1.2  —</w:t>
-      </w:r>
-      <w:proofErr w:type="gramEnd"/>
-      <w:r>
-        <w:rPr>
-          <w:i/>
-          <w:iCs/>
-          <w:sz w:val="24"/>
-          <w:szCs w:val="24"/>
-        </w:rPr>
-        <w:t xml:space="preserve">  April 2026</w:t>
+        <w:t>Version 1.2  —  April 2026</w:t>
       </w:r>
     </w:p>
     <w:p>
@@ -880,15 +860,7 @@
         <w:spacing w:after="160"/>
       </w:pPr>
       <w:r>
-        <w:t xml:space="preserve">The methodology is implemented through three objects. The Variable Library and Use Case Category taxonomy are shared across all conditions. The Condition Module and Use Case Specification are </w:t>
-      </w:r>
-      <w:proofErr w:type="gramStart"/>
-      <w:r>
-        <w:t>condition-specific</w:t>
-      </w:r>
-      <w:proofErr w:type="gramEnd"/>
-      <w:r>
-        <w:t>.</w:t>
+        <w:t>The methodology is implemented through three objects. The Variable Library and Use Case Category taxonomy are shared across all conditions. The Condition Module and Use Case Specification are condition-specific.</w:t>
       </w:r>
     </w:p>
     <w:p>
@@ -919,47 +891,7 @@
           <w:sz w:val="20"/>
           <w:szCs w:val="20"/>
         </w:rPr>
-        <w:t>Variable Library (</w:t>
-      </w:r>
-      <w:proofErr w:type="gramStart"/>
-      <w:r>
-        <w:rPr>
-          <w:rFonts w:ascii="Courier New" w:eastAsia="Courier New" w:hAnsi="Courier New" w:cs="Courier New"/>
-          <w:color w:val="2E75B6"/>
-          <w:sz w:val="20"/>
-          <w:szCs w:val="20"/>
-        </w:rPr>
-        <w:t>shared)  +</w:t>
-      </w:r>
-      <w:proofErr w:type="gramEnd"/>
-      <w:r>
-        <w:rPr>
-          <w:rFonts w:ascii="Courier New" w:eastAsia="Courier New" w:hAnsi="Courier New" w:cs="Courier New"/>
-          <w:color w:val="2E75B6"/>
-          <w:sz w:val="20"/>
-          <w:szCs w:val="20"/>
-        </w:rPr>
-        <w:t xml:space="preserve">  Use Case Category [</w:t>
-      </w:r>
-      <w:proofErr w:type="spellStart"/>
-      <w:r>
-        <w:rPr>
-          <w:rFonts w:ascii="Courier New" w:eastAsia="Courier New" w:hAnsi="Courier New" w:cs="Courier New"/>
-          <w:color w:val="2E75B6"/>
-          <w:sz w:val="20"/>
-          <w:szCs w:val="20"/>
-        </w:rPr>
-        <w:t>enum</w:t>
-      </w:r>
-      <w:proofErr w:type="spellEnd"/>
-      <w:r>
-        <w:rPr>
-          <w:rFonts w:ascii="Courier New" w:eastAsia="Courier New" w:hAnsi="Courier New" w:cs="Courier New"/>
-          <w:color w:val="2E75B6"/>
-          <w:sz w:val="20"/>
-          <w:szCs w:val="20"/>
-        </w:rPr>
-        <w:t xml:space="preserve"> field]</w:t>
+        <w:t>Variable Library (shared)  +  Use Case Category [enum field]</w:t>
       </w:r>
     </w:p>
     <w:p>
@@ -1015,27 +947,7 @@
           <w:sz w:val="20"/>
           <w:szCs w:val="20"/>
         </w:rPr>
-        <w:t>Use Case Specification(</w:t>
-      </w:r>
-      <w:proofErr w:type="gramStart"/>
-      <w:r>
-        <w:rPr>
-          <w:rFonts w:ascii="Courier New" w:eastAsia="Courier New" w:hAnsi="Courier New" w:cs="Courier New"/>
-          <w:color w:val="2E75B6"/>
-          <w:sz w:val="20"/>
-          <w:szCs w:val="20"/>
-        </w:rPr>
-        <w:t>s)  [</w:t>
-      </w:r>
-      <w:proofErr w:type="gramEnd"/>
-      <w:r>
-        <w:rPr>
-          <w:rFonts w:ascii="Courier New" w:eastAsia="Courier New" w:hAnsi="Courier New" w:cs="Courier New"/>
-          <w:color w:val="2E75B6"/>
-          <w:sz w:val="20"/>
-          <w:szCs w:val="20"/>
-        </w:rPr>
-        <w:t>core operational object]</w:t>
+        <w:t>Use Case Specification(s)  [core operational object]</w:t>
       </w:r>
     </w:p>
     <w:p>
@@ -1096,15 +1008,7 @@
       </w:pPr>
       <w:r>
         <w:lastRenderedPageBreak/>
-        <w:t xml:space="preserve">Code sets: the specific terminology codes used to identify the variable (LOINC, SNOMED, </w:t>
-      </w:r>
-      <w:proofErr w:type="spellStart"/>
-      <w:r>
-        <w:t>RxNorm</w:t>
-      </w:r>
-      <w:proofErr w:type="spellEnd"/>
-      <w:r>
-        <w:t>, ICD-10, etc.)</w:t>
+        <w:t>Code sets: the specific terminology codes used to identify the variable (LOINC, SNOMED, RxNorm, ICD-10, etc.)</w:t>
       </w:r>
     </w:p>
     <w:p>
@@ -1316,15 +1220,7 @@
         <w:spacing w:after="160"/>
       </w:pPr>
       <w:r>
-        <w:t>The Condition Module is implemented as a config file in the repository (conditions/diabetes/</w:t>
-      </w:r>
-      <w:proofErr w:type="spellStart"/>
-      <w:r>
-        <w:t>diabetes.config.json</w:t>
-      </w:r>
-      <w:proofErr w:type="spellEnd"/>
-      <w:r>
-        <w:t>, etc.) and is the governance artifact reviewed and approved before a condition is incorporated into the platform. It is also the fundable deliverable that condition-specific contributors and funders can point to.</w:t>
+        <w:t>The Condition Module is implemented as a config file in the repository (conditions/diabetes/diabetes.config.json, etc.) and is the governance artifact reviewed and approved before a condition is incorporated into the platform. It is also the fundable deliverable that condition-specific contributors and funders can point to.</w:t>
       </w:r>
     </w:p>
     <w:p>
@@ -1554,15 +1450,7 @@
           </w:tcPr>
           <w:p>
             <w:r>
-              <w:t xml:space="preserve">Specific use case identifier (e.g., </w:t>
-            </w:r>
-            <w:proofErr w:type="spellStart"/>
-            <w:r>
-              <w:t>diabetes_risk_stratification</w:t>
-            </w:r>
-            <w:proofErr w:type="spellEnd"/>
-            <w:r>
-              <w:t>)</w:t>
+              <w:t>Specific use case identifier (e.g., diabetes_risk_stratification)</w:t>
             </w:r>
           </w:p>
         </w:tc>
@@ -1616,29 +1504,8 @@
           </w:tcPr>
           <w:p>
             <w:r>
-              <w:t xml:space="preserve">Taxonomy field: </w:t>
-            </w:r>
-            <w:proofErr w:type="spellStart"/>
-            <w:r>
-              <w:t>risk_stratification</w:t>
-            </w:r>
-            <w:proofErr w:type="spellEnd"/>
-            <w:r>
-              <w:t xml:space="preserve"> | </w:t>
-            </w:r>
-            <w:proofErr w:type="spellStart"/>
-            <w:r>
-              <w:t>care_coordination_delivery</w:t>
-            </w:r>
-            <w:proofErr w:type="spellEnd"/>
-            <w:r>
-              <w:t xml:space="preserve"> | </w:t>
-            </w:r>
-            <w:proofErr w:type="spellStart"/>
-            <w:r>
-              <w:t>vbc_reporting</w:t>
-            </w:r>
-            <w:proofErr w:type="spellEnd"/>
+              <w:t>Taxonomy field: risk_stratification | care_coordination_delivery | vbc_reporting</w:t>
+            </w:r>
           </w:p>
         </w:tc>
       </w:tr>
@@ -2172,49 +2039,34 @@
         </w:numPr>
         <w:spacing w:after="80"/>
       </w:pPr>
-      <w:proofErr w:type="spellStart"/>
-      <w:r>
-        <w:t>risk_stratification</w:t>
-      </w:r>
-      <w:proofErr w:type="spellEnd"/>
-      <w:r>
-        <w:t xml:space="preserve"> — identifying patients at elevated clinical risk</w:t>
-      </w:r>
-    </w:p>
-    <w:p>
-      <w:pPr>
-        <w:pStyle w:val="ListParagraph"/>
-        <w:numPr>
-          <w:ilvl w:val="0"/>
-          <w:numId w:val="2"/>
-        </w:numPr>
-        <w:spacing w:after="80"/>
-      </w:pPr>
-      <w:proofErr w:type="spellStart"/>
-      <w:r>
-        <w:t>care_coordination_delivery</w:t>
-      </w:r>
-      <w:proofErr w:type="spellEnd"/>
-      <w:r>
-        <w:t xml:space="preserve"> — supporting active care management and delivery</w:t>
-      </w:r>
-    </w:p>
-    <w:p>
-      <w:pPr>
-        <w:pStyle w:val="ListParagraph"/>
-        <w:numPr>
-          <w:ilvl w:val="0"/>
-          <w:numId w:val="2"/>
-        </w:numPr>
-        <w:spacing w:after="80"/>
-      </w:pPr>
-      <w:proofErr w:type="spellStart"/>
-      <w:r>
-        <w:t>vbc_reporting</w:t>
-      </w:r>
-      <w:proofErr w:type="spellEnd"/>
-      <w:r>
-        <w:t xml:space="preserve"> — producing reportable metrics for value-based care programs</w:t>
+      <w:r>
+        <w:t>risk_stratification — identifying patients at elevated clinical risk</w:t>
+      </w:r>
+    </w:p>
+    <w:p>
+      <w:pPr>
+        <w:pStyle w:val="ListParagraph"/>
+        <w:numPr>
+          <w:ilvl w:val="0"/>
+          <w:numId w:val="2"/>
+        </w:numPr>
+        <w:spacing w:after="80"/>
+      </w:pPr>
+      <w:r>
+        <w:t>care_coordination_delivery — supporting active care management and delivery</w:t>
+      </w:r>
+    </w:p>
+    <w:p>
+      <w:pPr>
+        <w:pStyle w:val="ListParagraph"/>
+        <w:numPr>
+          <w:ilvl w:val="0"/>
+          <w:numId w:val="2"/>
+        </w:numPr>
+        <w:spacing w:after="80"/>
+      </w:pPr>
+      <w:r>
+        <w:t>vbc_reporting — producing reportable metrics for clinical quality and value-based care programs (HEDIS, NCQA quality measures, quality improvement programs, and value-based care reporting). Surfaced to users as “Clinical Quality + VBC Reporting”; the enum value vbc_reporting is unchanged.</w:t>
       </w:r>
     </w:p>
     <w:p>
@@ -2628,15 +2480,7 @@
         <w:spacing w:after="80"/>
       </w:pPr>
       <w:r>
-        <w:t>Insulin Use (</w:t>
-      </w:r>
-      <w:proofErr w:type="spellStart"/>
-      <w:r>
-        <w:t>RxNorm</w:t>
-      </w:r>
-      <w:proofErr w:type="spellEnd"/>
-      <w:r>
-        <w:t>)</w:t>
+        <w:t>Insulin Use (RxNorm)</w:t>
       </w:r>
     </w:p>
     <w:p>
@@ -2663,15 +2507,7 @@
         <w:spacing w:after="80"/>
       </w:pPr>
       <w:r>
-        <w:t>GLP-1 / SGLT2 Medications (</w:t>
-      </w:r>
-      <w:proofErr w:type="spellStart"/>
-      <w:r>
-        <w:t>RxNorm</w:t>
-      </w:r>
-      <w:proofErr w:type="spellEnd"/>
-      <w:r>
-        <w:t>)</w:t>
+        <w:t>GLP-1 / SGLT2 Medications (RxNorm)</w:t>
       </w:r>
     </w:p>
     <w:p>
@@ -2723,7 +2559,7 @@
         <w:spacing w:after="80"/>
       </w:pPr>
       <w:r>
-        <w:t>Diabetes VBC Reporting</w:t>
+        <w:t>Diabetes Clinical Quality + VBC Reporting</w:t>
       </w:r>
     </w:p>
     <w:p>
@@ -2875,11 +2711,9 @@
             </w:tcMar>
           </w:tcPr>
           <w:p>
-            <w:proofErr w:type="spellStart"/>
             <w:r>
               <w:t>diabetes_risk_stratification</w:t>
             </w:r>
-            <w:proofErr w:type="spellEnd"/>
           </w:p>
         </w:tc>
       </w:tr>
@@ -2935,11 +2769,9 @@
             </w:tcMar>
           </w:tcPr>
           <w:p>
-            <w:proofErr w:type="spellStart"/>
             <w:r>
               <w:t>risk_stratification</w:t>
             </w:r>
-            <w:proofErr w:type="spellEnd"/>
           </w:p>
         </w:tc>
       </w:tr>
@@ -3077,20 +2909,20 @@
         <w:spacing w:after="80"/>
       </w:pPr>
       <w:r>
-        <w:t>A1C — required</w:t>
-      </w:r>
-    </w:p>
-    <w:p>
-      <w:pPr>
-        <w:pStyle w:val="ListParagraph"/>
-        <w:numPr>
-          <w:ilvl w:val="0"/>
-          <w:numId w:val="2"/>
-        </w:numPr>
-        <w:spacing w:after="80"/>
-      </w:pPr>
-      <w:r>
-        <w:t>CGM Glucose — preferred; evaluated if device feed is present</w:t>
+        <w:t>CGM Glucose — device pathway, evaluated first (cgm_primary)</w:t>
+      </w:r>
+    </w:p>
+    <w:p>
+      <w:pPr>
+        <w:pStyle w:val="ListParagraph"/>
+        <w:numPr>
+          <w:ilvl w:val="0"/>
+          <w:numId w:val="2"/>
+        </w:numPr>
+        <w:spacing w:after="80"/>
+      </w:pPr>
+      <w:r>
+        <w:t>A1C — EHR fallback pathway, evaluated when the device pathway does not pass (a1c_fallback); the clinical default lab measure, often missing or stale in target settings</w:t>
       </w:r>
     </w:p>
     <w:p>
@@ -3195,20 +3027,20 @@
         <w:spacing w:after="80"/>
       </w:pPr>
       <w:r>
-        <w:t>Compute Time in Range (TIR) from raw CGM readings if CGM variable is READY</w:t>
-      </w:r>
-    </w:p>
-    <w:p>
-      <w:pPr>
-        <w:pStyle w:val="ListParagraph"/>
-        <w:numPr>
-          <w:ilvl w:val="0"/>
-          <w:numId w:val="2"/>
-        </w:numPr>
-        <w:spacing w:after="80"/>
-      </w:pPr>
-      <w:r>
-        <w:t>Combine A1C value and CGM-derived TIR into composite glycemic risk indicator</w:t>
+        <w:t>Evaluate the ordered pathway: the device pathway (cgm_primary) is evaluated first. When the CGM variable is READY, compute Time in Range (TIR) and the device-derived metrics from raw CGM readings and establish stratification from the device pathway.</w:t>
+      </w:r>
+    </w:p>
+    <w:p>
+      <w:pPr>
+        <w:pStyle w:val="ListParagraph"/>
+        <w:numPr>
+          <w:ilvl w:val="0"/>
+          <w:numId w:val="2"/>
+        </w:numPr>
+        <w:spacing w:after="80"/>
+      </w:pPr>
+      <w:r>
+        <w:t>When the device pathway does not pass, fall back to the EHR-sourced A1C measure (a1c_fallback). This is an ordered pathway, not a composite blend of the A1C value and CGM-derived TIR. Record the outcome per use_case_pathway_results (primary_pass / fallback_pass / no_valid_pathway). See Methodology Architecture Section 6 for the ordered-pathway framing.</w:t>
       </w:r>
     </w:p>
     <w:p>
@@ -3299,7 +3131,7 @@
         <w:pStyle w:val="Heading2"/>
       </w:pPr>
       <w:r>
-        <w:t>5.3 Use Case Specification: Diabetes VBC Reporting</w:t>
+        <w:t>5.3 Use Case Specification: Diabetes Clinical Quality + VBC Reporting</w:t>
       </w:r>
     </w:p>
     <w:p>
@@ -3438,11 +3270,9 @@
             </w:tcMar>
           </w:tcPr>
           <w:p>
-            <w:proofErr w:type="spellStart"/>
             <w:r>
               <w:t>diabetes_vbc_reporting</w:t>
             </w:r>
-            <w:proofErr w:type="spellEnd"/>
           </w:p>
         </w:tc>
       </w:tr>
@@ -3498,11 +3328,9 @@
             </w:tcMar>
           </w:tcPr>
           <w:p>
-            <w:proofErr w:type="spellStart"/>
             <w:r>
               <w:t>vbc_reporting</w:t>
             </w:r>
-            <w:proofErr w:type="spellEnd"/>
           </w:p>
         </w:tc>
       </w:tr>
@@ -3559,7 +3387,7 @@
           </w:tcPr>
           <w:p>
             <w:r>
-              <w:t>Produce reportable measure outputs for diabetes-related VBC program requirements</w:t>
+              <w:t>Produce reportable measure outputs for diabetes-related clinical quality and value-based care program requirements, including HEDIS, NCQA quality measures, quality improvement programs, and VBC reporting</w:t>
             </w:r>
           </w:p>
         </w:tc>
@@ -4160,15 +3988,7 @@
           </w:tcPr>
           <w:p>
             <w:r>
-              <w:t xml:space="preserve">Directionally </w:t>
-            </w:r>
-            <w:proofErr w:type="gramStart"/>
-            <w:r>
-              <w:t>similar to</w:t>
-            </w:r>
-            <w:proofErr w:type="gramEnd"/>
-            <w:r>
-              <w:t xml:space="preserve"> part of a Condition Module in that it defines relevant variables, value sets, and thresholds for a disease area. This model carries the concept one layer further by defining the condition-specific operational use case the data must support, including population eligibility, variable application rules, and computation logic required to execute risk stratification, care coordination, or VBC reporting.</w:t>
+              <w:t>Directionally similar to part of a Condition Module in that it defines relevant variables, value sets, and thresholds for a disease area. This model carries the concept one layer further by defining the condition-specific operational use case the data must support, including population eligibility, variable application rules, and computation logic required to execute risk stratification, care coordination, or VBC reporting.</w:t>
             </w:r>
           </w:p>
         </w:tc>
@@ -4636,23 +4456,7 @@
           </w:tcPr>
           <w:p>
             <w:r>
-              <w:t xml:space="preserve">Implements the four-tier schema (Raw → Normalized → Check Results/Patches → Use-Case Ready) that supports the three-stage methodology. </w:t>
-            </w:r>
-            <w:proofErr w:type="spellStart"/>
-            <w:r>
-              <w:t>check_</w:t>
-            </w:r>
-            <w:proofErr w:type="gramStart"/>
-            <w:r>
-              <w:t>results.check</w:t>
-            </w:r>
-            <w:proofErr w:type="gramEnd"/>
-            <w:r>
-              <w:t>_scope</w:t>
-            </w:r>
-            <w:proofErr w:type="spellEnd"/>
-            <w:r>
-              <w:t xml:space="preserve"> field maps to variable-level vs. use-case-level evaluation.</w:t>
+              <w:t>Implements the four-tier schema (Raw → Normalized → Check Results/Patches → Use-Case Ready) that supports the three-stage methodology. check_results.check_scope field maps to variable-level vs. use-case-level evaluation.</w:t>
             </w:r>
           </w:p>
         </w:tc>
@@ -4706,20 +4510,7 @@
           </w:tcPr>
           <w:p>
             <w:r>
-              <w:t>The condition module schema (</w:t>
-            </w:r>
-            <w:proofErr w:type="spellStart"/>
-            <w:r>
-              <w:t>diabetes.</w:t>
-            </w:r>
-            <w:proofErr w:type="gramStart"/>
-            <w:r>
-              <w:t>config.json</w:t>
-            </w:r>
-            <w:proofErr w:type="spellEnd"/>
-            <w:proofErr w:type="gramEnd"/>
-            <w:r>
-              <w:t>) is the machine-readable implementation of a Condition Module + Use Case Specification set. The schema must conform to the object model defined in this document.</w:t>
+              <w:t>The condition module schema (diabetes.config.json) is the machine-readable implementation of a Condition Module + Use Case Specification set. The schema must conform to the object model defined in this document.</w:t>
             </w:r>
           </w:p>
         </w:tc>
@@ -4918,29 +4709,7 @@
           <w:sz w:val="18"/>
           <w:szCs w:val="18"/>
         </w:rPr>
-        <w:t xml:space="preserve">Oros — Shared infrastructure for data-driven </w:t>
-      </w:r>
-      <w:proofErr w:type="gramStart"/>
-      <w:r>
-        <w:rPr>
-          <w:i/>
-          <w:iCs/>
-          <w:color w:val="2E75B6"/>
-          <w:sz w:val="18"/>
-          <w:szCs w:val="18"/>
-        </w:rPr>
-        <w:t>care  —</w:t>
-      </w:r>
-      <w:proofErr w:type="gramEnd"/>
-      <w:r>
-        <w:rPr>
-          <w:i/>
-          <w:iCs/>
-          <w:color w:val="2E75B6"/>
-          <w:sz w:val="18"/>
-          <w:szCs w:val="18"/>
-        </w:rPr>
-        <w:t xml:space="preserve">  oros.ai</w:t>
+        <w:t>Oros — Shared infrastructure for data-driven care  —  oros.ai</w:t>
       </w:r>
     </w:p>
     <w:sectPr>

</xml_diff>

<commit_message>
Lock Demo UI/UX spec and register in CLAUDE.md §14; align Build Plan with two-phase methodology (bug-set expansion)
Co-Authored-By: Claude Opus 4.8 (1M context) <noreply@anthropic.com>
</commit_message>
<xml_diff>
--- a/docs/Oros - CKM Data Readiness - Architecture Specification.docx
+++ b/docs/Oros - CKM Data Readiness - Architecture Specification.docx
@@ -781,6 +781,19 @@
         </w:tc>
       </w:tr>
     </w:tbl>
+    <w:p>
+      <w:pPr>
+        <w:spacing w:after="120"/>
+      </w:pPr>
+    </w:p>
+    <w:p>
+      <w:pPr>
+        <w:spacing w:after="120"/>
+      </w:pPr>
+      <w:r>
+        <w:t>The three stages above are the object-model view. The Methodology Architecture (Section 6) describes the same evaluation as a two-phase readiness model, Foundational readiness then Fit-for-purpose readiness, feeding an assess, report, respond pipeline. The two views are consistent: Stage 1 work that is use-case-independent is Foundational readiness, and Stage 2 fit-for-purpose evaluation is Fit-for-purpose readiness. The Methodology Architecture is canonical for the phase model and step definitions.</w:t>
+      </w:r>
+    </w:p>
     <w:p>
       <w:pPr>
         <w:spacing w:after="120"/>

</xml_diff>